<commit_message>
Lab07 Finished both sprawozdanie and the code, time for the merge
</commit_message>
<xml_diff>
--- a/cpp/Paradygmaty_programowania/Zadania/Lab07/Sprawozdanie.docx
+++ b/cpp/Paradygmaty_programowania/Zadania/Lab07/Sprawozdanie.docx
@@ -10,6 +10,7 @@
           <w:numId w:val="1"/>
         </w:numPr>
         <w:bidi w:val="0"/>
+        <w:spacing w:lineRule="auto" w:line="276"/>
         <w:jc w:val="start"/>
         <w:rPr/>
       </w:pPr>
@@ -34,6 +35,7 @@
           <w:numId w:val="0"/>
         </w:numPr>
         <w:bidi w:val="0"/>
+        <w:spacing w:lineRule="auto" w:line="276"/>
         <w:ind w:hanging="0" w:start="720"/>
         <w:jc w:val="start"/>
         <w:rPr/>
@@ -51,6 +53,7 @@
           <w:numId w:val="2"/>
         </w:numPr>
         <w:bidi w:val="0"/>
+        <w:spacing w:lineRule="auto" w:line="276"/>
         <w:jc w:val="start"/>
         <w:rPr/>
       </w:pPr>
@@ -67,6 +70,7 @@
           <w:numId w:val="2"/>
         </w:numPr>
         <w:bidi w:val="0"/>
+        <w:spacing w:lineRule="auto" w:line="276"/>
         <w:jc w:val="start"/>
         <w:rPr/>
       </w:pPr>
@@ -83,6 +87,7 @@
           <w:numId w:val="2"/>
         </w:numPr>
         <w:bidi w:val="0"/>
+        <w:spacing w:lineRule="auto" w:line="276"/>
         <w:jc w:val="start"/>
         <w:rPr/>
       </w:pPr>
@@ -99,6 +104,7 @@
           <w:numId w:val="1"/>
         </w:numPr>
         <w:bidi w:val="0"/>
+        <w:spacing w:lineRule="auto" w:line="276"/>
         <w:jc w:val="start"/>
         <w:rPr/>
       </w:pPr>
@@ -123,6 +129,7 @@
           <w:numId w:val="0"/>
         </w:numPr>
         <w:bidi w:val="0"/>
+        <w:spacing w:lineRule="auto" w:line="276"/>
         <w:ind w:hanging="0" w:start="1080"/>
         <w:jc w:val="start"/>
         <w:rPr/>
@@ -140,6 +147,7 @@
           <w:numId w:val="3"/>
         </w:numPr>
         <w:bidi w:val="0"/>
+        <w:spacing w:lineRule="auto" w:line="276"/>
         <w:jc w:val="start"/>
         <w:rPr/>
       </w:pPr>
@@ -156,6 +164,7 @@
           <w:numId w:val="3"/>
         </w:numPr>
         <w:bidi w:val="0"/>
+        <w:spacing w:lineRule="auto" w:line="276"/>
         <w:jc w:val="start"/>
         <w:rPr/>
       </w:pPr>
@@ -172,6 +181,7 @@
           <w:numId w:val="3"/>
         </w:numPr>
         <w:bidi w:val="0"/>
+        <w:spacing w:lineRule="auto" w:line="276"/>
         <w:jc w:val="start"/>
         <w:rPr/>
       </w:pPr>
@@ -188,6 +198,7 @@
           <w:numId w:val="3"/>
         </w:numPr>
         <w:bidi w:val="0"/>
+        <w:spacing w:lineRule="auto" w:line="276"/>
         <w:jc w:val="start"/>
         <w:rPr/>
       </w:pPr>
@@ -200,6 +211,7 @@
       <w:pPr>
         <w:pStyle w:val="Normal"/>
         <w:bidi w:val="0"/>
+        <w:spacing w:lineRule="auto" w:line="276"/>
         <w:jc w:val="start"/>
         <w:rPr/>
       </w:pPr>
@@ -217,6 +229,7 @@
           <w:numId w:val="4"/>
         </w:numPr>
         <w:bidi w:val="0"/>
+        <w:spacing w:lineRule="auto" w:line="276"/>
         <w:jc w:val="start"/>
         <w:rPr/>
       </w:pPr>
@@ -233,6 +246,7 @@
           <w:numId w:val="4"/>
         </w:numPr>
         <w:bidi w:val="0"/>
+        <w:spacing w:lineRule="auto" w:line="276"/>
         <w:jc w:val="start"/>
         <w:rPr/>
       </w:pPr>
@@ -256,6 +270,7 @@
           <w:numId w:val="1"/>
         </w:numPr>
         <w:bidi w:val="0"/>
+        <w:spacing w:lineRule="auto" w:line="276"/>
         <w:jc w:val="start"/>
         <w:rPr/>
       </w:pPr>
@@ -274,6 +289,7 @@
           <w:numId w:val="0"/>
         </w:numPr>
         <w:bidi w:val="0"/>
+        <w:spacing w:lineRule="auto" w:line="276"/>
         <w:ind w:hanging="0" w:start="720"/>
         <w:jc w:val="start"/>
         <w:rPr/>
@@ -291,6 +307,7 @@
           <w:numId w:val="1"/>
         </w:numPr>
         <w:bidi w:val="0"/>
+        <w:spacing w:lineRule="auto" w:line="276"/>
         <w:jc w:val="start"/>
         <w:rPr/>
       </w:pPr>
@@ -300,6 +317,10 @@
         <w:br/>
         <w:t>O:</w:t>
       </w:r>
+      <w:r>
+        <w:rPr/>
+        <w:t xml:space="preserve">Zastosowano walidacje danych (np. If(pensja&lt;0)) oraz kontrole wejscia w funkcji main, która sprawdza poprawność strumienia std::cin oraz zakresy wartości przed samym utworzeniem obiektu. </w:t>
+      </w:r>
     </w:p>
     <w:p>
       <w:pPr>
@@ -309,6 +330,7 @@
           <w:numId w:val="1"/>
         </w:numPr>
         <w:bidi w:val="0"/>
+        <w:spacing w:lineRule="auto" w:line="276"/>
         <w:jc w:val="start"/>
         <w:rPr/>
       </w:pPr>
@@ -325,6 +347,7 @@
           <w:numId w:val="0"/>
         </w:numPr>
         <w:bidi w:val="0"/>
+        <w:spacing w:lineRule="auto" w:line="276"/>
         <w:ind w:hanging="0" w:start="720"/>
         <w:jc w:val="start"/>
         <w:rPr/>
@@ -333,6 +356,10 @@
         <w:rPr/>
         <w:t>O:</w:t>
       </w:r>
+      <w:r>
+        <w:rPr/>
+        <w:t>Polega ona na odzieleniu interfejsu(metody publiczne) od implementacji I danych(pola prywatne). Użytkownik klasy korzysta z gotowych metod, nie mając wzglądu ani możliwości bezpośredniego zepsucia wewnętrznej struktury danych obiektu.</w:t>
+      </w:r>
     </w:p>
     <w:p>
       <w:pPr>
@@ -342,6 +369,7 @@
           <w:numId w:val="1"/>
         </w:numPr>
         <w:bidi w:val="0"/>
+        <w:spacing w:lineRule="auto" w:line="276"/>
         <w:jc w:val="start"/>
         <w:rPr/>
       </w:pPr>
@@ -351,6 +379,10 @@
         <w:br/>
         <w:t>O:</w:t>
       </w:r>
+      <w:r>
+        <w:rPr/>
+        <w:t xml:space="preserve">Odziedziczone zostały wszystkie pola prywante(dostępne poprzez metody oraz konstruktor bazy) oraz deklarację metod wirtualnych jak obliczPensje() I wyswietl().  </w:t>
+      </w:r>
     </w:p>
     <w:p>
       <w:pPr>
@@ -360,6 +392,7 @@
           <w:numId w:val="1"/>
         </w:numPr>
         <w:bidi w:val="0"/>
+        <w:spacing w:lineRule="auto" w:line="276"/>
         <w:jc w:val="start"/>
         <w:rPr/>
       </w:pPr>
@@ -369,6 +402,14 @@
         <w:br/>
         <w:t>O:</w:t>
       </w:r>
+      <w:r>
+        <w:rPr/>
+        <w:t>Pozwoliło na uniknięcie po</w:t>
+      </w:r>
+      <w:r>
+        <w:rPr/>
+        <w:t>wtarzania kodu dla pól wspólnych oraz umożliwiło stworzenie polimorficznego kontenera std::vector&lt;Pracownik*&gt;, który może zarządzać różnymi typami pracowników w sposób jednolity</w:t>
+      </w:r>
     </w:p>
     <w:p>
       <w:pPr>
@@ -378,6 +419,7 @@
           <w:numId w:val="1"/>
         </w:numPr>
         <w:bidi w:val="0"/>
+        <w:spacing w:lineRule="auto" w:line="276"/>
         <w:jc w:val="start"/>
         <w:rPr/>
       </w:pPr>
@@ -387,6 +429,10 @@
         <w:br/>
         <w:t>O:</w:t>
       </w:r>
+      <w:r>
+        <w:rPr/>
+        <w:t>Tak, wtedy byłaby po prostu jedna klasa z polem enum w celu wyboru typu pracownika oraz wymagana byłaby dodatkowa insturkcja switch do kazdej metody I niepotrzebne marnowanie pamięci na nieużywane pola dla danego typu umowy. Skalowalność takiego rozwiązania na dłuższą metę byłaby by bardzo niska</w:t>
+      </w:r>
     </w:p>
     <w:p>
       <w:pPr>
@@ -396,6 +442,7 @@
           <w:numId w:val="1"/>
         </w:numPr>
         <w:bidi w:val="0"/>
+        <w:spacing w:lineRule="auto" w:line="276"/>
         <w:jc w:val="start"/>
         <w:rPr/>
       </w:pPr>
@@ -405,6 +452,10 @@
         <w:br/>
         <w:t>O:</w:t>
       </w:r>
+      <w:r>
+        <w:rPr/>
+        <w:t>Metody, które zostały zadeklarowane jako wirtualne to np. Destruktor(dla bezpiecznego usuwania0, obliczPensje() oraz wyswietl(). Pozwala to na wywołanie właściwej wersji metody w zależności od typu obiektu wywołanej przez wskaźnik klasy bazowej</w:t>
+      </w:r>
     </w:p>
     <w:p>
       <w:pPr>
@@ -414,6 +465,7 @@
           <w:numId w:val="1"/>
         </w:numPr>
         <w:bidi w:val="0"/>
+        <w:spacing w:lineRule="auto" w:line="276"/>
         <w:jc w:val="start"/>
         <w:rPr/>
       </w:pPr>
@@ -423,6 +475,10 @@
         <w:br/>
         <w:t>O:</w:t>
       </w:r>
+      <w:r>
+        <w:rPr/>
+        <w:t>W pętli przechodzącej przez wektor wskaźników Pracownik* . Program dopiero w czasie wykonywanie rozstrzyga, czy pod wskaźnikiem kryje się etatowiec, godzinowiec. Uruchamia odpowiednią logikę obliczeń.</w:t>
+      </w:r>
     </w:p>
     <w:p>
       <w:pPr>
@@ -432,6 +488,7 @@
           <w:numId w:val="1"/>
         </w:numPr>
         <w:bidi w:val="0"/>
+        <w:spacing w:lineRule="auto" w:line="276"/>
         <w:jc w:val="start"/>
         <w:rPr/>
       </w:pPr>
@@ -441,6 +498,10 @@
         <w:br/>
         <w:t>O:</w:t>
       </w:r>
+      <w:r>
+        <w:rPr/>
+        <w:t>Kompilator zastosuje wczesne wiązanie I wywoła wiązanie z metodą bazową. Ponieważ w tym projekcie jest ona czysto wirtualna, brak słowa virtual( I implementacji) uniemożliwiłoby kompilacje oraz wywołanie poprawnej logiki.</w:t>
+      </w:r>
     </w:p>
     <w:p>
       <w:pPr>
@@ -450,6 +511,7 @@
           <w:numId w:val="1"/>
         </w:numPr>
         <w:bidi w:val="0"/>
+        <w:spacing w:lineRule="auto" w:line="276"/>
         <w:jc w:val="start"/>
         <w:rPr/>
       </w:pPr>
@@ -457,7 +519,11 @@
         <w:rPr/>
         <w:t>P:Jakie są największe zalety podejścia obiektowego w tym zadaniu?</w:t>
         <w:br/>
-        <w:t>O:</w:t>
+        <w:t xml:space="preserve">O: </w:t>
+      </w:r>
+      <w:r>
+        <w:rPr/>
+        <w:t>Łatwa rozszerzalność, dodanie nowego pracownika wymaga dodania dodatkowej klasy, zamiast modyfikacji logiki działania programu czy klasy bazowej</w:t>
       </w:r>
     </w:p>
     <w:p>
@@ -468,6 +534,7 @@
           <w:numId w:val="1"/>
         </w:numPr>
         <w:bidi w:val="0"/>
+        <w:spacing w:lineRule="auto" w:line="276"/>
         <w:jc w:val="start"/>
         <w:rPr/>
       </w:pPr>
@@ -475,7 +542,33 @@
         <w:rPr/>
         <w:t>P:Jakie są ograniczenia podejścia obiektowego w tym zadaniu?</w:t>
         <w:br/>
-        <w:t>O:</w:t>
+        <w:t xml:space="preserve">O: </w:t>
+      </w:r>
+      <w:r>
+        <w:rPr/>
+        <w:t xml:space="preserve">Należy do nich konieczność ręćznego zarządzania pamięcią w przypadku </w:t>
+      </w:r>
+      <w:r>
+        <w:rPr>
+          <w:b/>
+          <w:bCs/>
+        </w:rPr>
+        <w:t>new</w:t>
+      </w:r>
+      <w:r>
+        <w:rPr/>
+        <w:t xml:space="preserve"> I </w:t>
+      </w:r>
+      <w:r>
+        <w:rPr>
+          <w:b/>
+          <w:bCs/>
+        </w:rPr>
+        <w:t>delete</w:t>
+      </w:r>
+      <w:r>
+        <w:rPr/>
+        <w:t xml:space="preserve">  oraz minimalny narzut na tablicę metod wirtualnych </w:t>
       </w:r>
     </w:p>
     <w:sectPr>
@@ -1202,8 +1295,8 @@
     <w:qFormat/>
     <w:rPr/>
   </w:style>
-  <w:style w:type="character" w:styleId="Bullets">
-    <w:name w:val="Bullets"/>
+  <w:style w:type="character" w:styleId="Bulletsuser">
+    <w:name w:val="Bullets (user)"/>
     <w:qFormat/>
     <w:rPr>
       <w:rFonts w:ascii="OpenSymbol" w:hAnsi="OpenSymbol" w:eastAsia="OpenSymbol" w:cs="OpenSymbol"/>

</xml_diff>